<commit_message>
Pass monarch and initiative on when their holder leaves
Follow Magic CR 724.4/725.4: a leaving holder's monarch or initiative
goes to the active player, or the next living player in turn order when
the active player is leaving, on Atlas and in standalone games. Crown
claims are also refused while a win claim is pending.

Co-Authored-By: Claude Opus 5.5 (1M context) <noreply@anthropic.com>
Claude-Session: https://claude.ai/code/session_01FWNbrtwxisEVkEer5cVoDg
</commit_message>
<xml_diff>
--- a/Documentation/User Manual/TurnHub Manual V0.18.docx
+++ b/Documentation/User Manual/TurnHub Manual V0.18.docx
@@ -7518,7 +7518,7 @@
     </ns0:p>
     <ns0:p>
       <ns0:r>
-        <ns0:t>Choose I’m the monarch in your player controls or the More drawer on your table tile. While paused, the table also lists the monarch controls. A crown and Monarch label identify the holder. Only one player can be monarch: claiming it immediately transfers the crown. In team games, the crown belongs to the named individual. If the holder concedes or is eliminated, the crown clears. It survives pause and game recovery, and resets for a new match. Players resolve the card’s combat and draw rules themselves.</ns0:t>
+        <ns0:t>Choose I’m the monarch in your player controls or the More drawer on your table tile. While paused, the table also lists the monarch controls. A crown and Monarch label identify the holder. Only one player can be monarch: claiming it immediately transfers the crown. In team games, the crown belongs to the named individual. If the holder concedes or is eliminated, the crown passes to the player whose turn it is, or to the next player in turn order when the holder was taking that turn. It survives pause and game recovery, and resets for a new match. Players resolve the card’s combat and draw rules themselves.</ns0:t>
       </ns0:r>
     </ns0:p>
     <ns0:p>
@@ -7551,7 +7551,7 @@
     </ns0:p>
     <ns0:p>
       <ns0:r>
-        <ns0:t>Counters and statuses survive app close and game recovery. New matches clear them. Leaving the game clears held initiative and monarch. Connected counter/status controls need Atlas to be answering; standalone games apply them locally.</ns0:t>
+        <ns0:t>Counters and statuses survive app close and game recovery. New matches clear them. When a holder leaves the game, initiative and monarch pass the same way: to the player whose turn it is, or to the next player in turn order. Connected counter/status controls need Atlas to be answering; standalone games apply them locally.</ns0:t>
       </ns0:r>
     </ns0:p>
     <ns0:p>

</xml_diff>